<commit_message>
Add government and court-disposition fallbacks to Article VII
Article VII (Dissolution) previously provided only for distribution to a
501(c)(3) organization. Restructured into lettered subsections A-C to match
the formatting of Articles II and V, adding the two fallbacks from the IRS
Pub. 557 sample dissolution clause:

- B: distribution to the federal, state, or local government for a public
  purpose
- C: disposition by a court of competent jurisdiction for assets not
  otherwise disposed of

Subsection A is the original clause, unchanged. "Court of competent
jurisdiction" is used rather than naming the Superior Court so the clause
survives a move of the principal office out of California.

Co-Authored-By: Claude Opus 5 (1M context) <noreply@anthropic.com>
</commit_message>
<xml_diff>
--- a/Gold_Mining_Circle_Foundation_Articles_DRAFT.docx
+++ b/Gold_Mining_Circle_Foundation_Articles_DRAFT.docx
@@ -352,11 +352,50 @@
     </w:p>
     <w:p>
       <w:pPr>
-        <w:spacing w:after="160" w:line="300"/>
-        <w:jc w:val="both"/>
-      </w:pPr>
+        <w:tabs>
+          <w:tab w:val="left" w:pos="720"/>
+        </w:tabs>
+        <w:spacing w:after="160" w:line="300"/>
+        <w:ind w:left="720" w:hanging="360"/>
+        <w:jc w:val="both"/>
+      </w:pPr>
+      <w:r>
+        <w:t xml:space="preserve">A.	</w:t>
+      </w:r>
       <w:r>
         <w:t xml:space="preserve">Upon the dissolution or winding up of this corporation, its assets remaining after payment, or provision for payment, of all debts and liabilities of this corporation shall be distributed to a nonprofit fund, foundation, or corporation which is organized and operated exclusively for charitable purposes and which has established its tax-exempt status under Section 501(c)(3) of the Internal Revenue Code.</w:t>
+      </w:r>
+    </w:p>
+    <w:p>
+      <w:pPr>
+        <w:tabs>
+          <w:tab w:val="left" w:pos="720"/>
+        </w:tabs>
+        <w:spacing w:after="160" w:line="300"/>
+        <w:ind w:left="720" w:hanging="360"/>
+        <w:jc w:val="both"/>
+      </w:pPr>
+      <w:r>
+        <w:t xml:space="preserve">B.	</w:t>
+      </w:r>
+      <w:r>
+        <w:t xml:space="preserve">In the alternative, such assets may be distributed to the federal government, or to a state or local government, for a public purpose.</w:t>
+      </w:r>
+    </w:p>
+    <w:p>
+      <w:pPr>
+        <w:tabs>
+          <w:tab w:val="left" w:pos="720"/>
+        </w:tabs>
+        <w:spacing w:after="160" w:line="300"/>
+        <w:ind w:left="720" w:hanging="360"/>
+        <w:jc w:val="both"/>
+      </w:pPr>
+      <w:r>
+        <w:t xml:space="preserve">C.	</w:t>
+      </w:r>
+      <w:r>
+        <w:t xml:space="preserve">Any such assets not so disposed of shall be disposed of by a court of competent jurisdiction of the county in which the principal office of the corporation is then located, exclusively for charitable purposes or to such organization or organizations, as said court shall determine, which are organized and operated exclusively for such purposes.</w:t>
       </w:r>
     </w:p>
     <w:p>

</xml_diff>